<commit_message>
Thêm trang register.php với form và logic đăng ký
</commit_message>
<xml_diff>
--- a/OneDrive/Máy tính/Dự_Án_Web_Cá_Nhân/Lo-Trinh-CT428.docx
+++ b/OneDrive/Máy tính/Dự_Án_Web_Cá_Nhân/Lo-Trinh-CT428.docx
@@ -69,6 +69,11 @@
     <w:p>
       <w:pPr>
         <w:pStyle w:val="ListBullet"/>
+      </w:pPr>
+    </w:p>
+    <w:p>
+      <w:pPr>
+        <w:pStyle w:val="ListBullet"/>
         <w:numPr>
           <w:ilvl w:val="0"/>
           <w:numId w:val="0"/>
@@ -77,6 +82,20 @@
       </w:pPr>
       <w:r>
         <w:t xml:space="preserve">- </w:t>
+      </w:r>
+      <w:r>
+        <w:rPr>
+          <w:b/>
+          <w:bCs/>
+        </w:rPr>
+        <w:t>Phần đang thực hiện:</w:t>
+      </w:r>
+      <w:r>
+        <w:rPr>
+          <w:b/>
+          <w:bCs/>
+        </w:rPr>
+        <w:t xml:space="preserve"> </w:t>
       </w:r>
       <w:r>
         <w:t>Thiết kế cấu trúc bảng quản lý người dùng (Users) và xây dựng phương thức Đăng ký (Registration) tích hợp cơ chế băm mật khẩu an toàn</w:t>
@@ -117,6 +136,82 @@
       <w:r>
         <w:t>.</w:t>
       </w:r>
+    </w:p>
+    <w:p>
+      <w:pPr>
+        <w:pStyle w:val="ListBullet"/>
+        <w:numPr>
+          <w:ilvl w:val="0"/>
+          <w:numId w:val="0"/>
+        </w:numPr>
+        <w:ind w:left="360"/>
+      </w:pPr>
+    </w:p>
+    <w:p>
+      <w:pPr>
+        <w:pStyle w:val="ListBullet"/>
+        <w:numPr>
+          <w:ilvl w:val="0"/>
+          <w:numId w:val="0"/>
+        </w:numPr>
+        <w:ind w:left="360"/>
+      </w:pPr>
+      <w:r>
+        <w:t>-</w:t>
+      </w:r>
+      <w:r>
+        <w:t xml:space="preserve">  </w:t>
+      </w:r>
+      <w:r>
+        <w:rPr>
+          <w:b/>
+          <w:bCs/>
+        </w:rPr>
+        <w:t>Phần đang thực hiện:</w:t>
+      </w:r>
+      <w:r>
+        <w:t xml:space="preserve"> Xây dựng Giao diện Đăng ký (Frontend) và Xử lý Luồng Dữ liệu Form (Backend). </w:t>
+      </w:r>
+      <w:r>
+        <w:rPr>
+          <w:b/>
+          <w:bCs/>
+        </w:rPr>
+        <w:t>Vị trí tác chiến:</w:t>
+      </w:r>
+      <w:r>
+        <w:t xml:space="preserve"> Thư mục gốc (tạo file register.php).  </w:t>
+      </w:r>
+      <w:r>
+        <w:rPr>
+          <w:b/>
+          <w:bCs/>
+        </w:rPr>
+        <w:t>Tiến độ hiện tại:</w:t>
+      </w:r>
+      <w:r>
+        <w:t xml:space="preserve"> </w:t>
+      </w:r>
+      <w:r>
+        <w:rPr>
+          <w:b/>
+          <w:bCs/>
+        </w:rPr>
+        <w:t>25%</w:t>
+      </w:r>
+      <w:r>
+        <w:t>.</w:t>
+      </w:r>
+    </w:p>
+    <w:p>
+      <w:pPr>
+        <w:pStyle w:val="ListBullet"/>
+        <w:numPr>
+          <w:ilvl w:val="0"/>
+          <w:numId w:val="0"/>
+        </w:numPr>
+        <w:ind w:left="360"/>
+      </w:pPr>
     </w:p>
     <w:p>
       <w:pPr>
@@ -171,6 +266,7 @@
         <w:pStyle w:val="Heading1"/>
       </w:pPr>
       <w:r>
+        <w:lastRenderedPageBreak/>
         <w:t>Tuần 3: Tương tác Cơ sở dữ liệu, AJAX và Bảo mật (Chương 6)</w:t>
       </w:r>
     </w:p>
@@ -203,7 +299,6 @@
         <w:pStyle w:val="ListBullet2"/>
       </w:pPr>
       <w:r>
-        <w:lastRenderedPageBreak/>
         <w:t>Viết mã AJAX giao tiếp bất đồng bộ, ứng dụng vào việc kiểm tra tên đăng nhập bị trùng ngay tại form đăng ký.</w:t>
       </w:r>
     </w:p>
@@ -11863,6 +11958,19 @@
       </w:tcPr>
     </w:tblStylePr>
   </w:style>
+  <w:style w:type="paragraph" w:styleId="NormalWeb">
+    <w:name w:val="Normal (Web)"/>
+    <w:basedOn w:val="Normal"/>
+    <w:uiPriority w:val="99"/>
+    <w:semiHidden/>
+    <w:unhideWhenUsed/>
+    <w:rsid w:val="005D57C7"/>
+    <w:rPr>
+      <w:rFonts w:ascii="Times New Roman" w:hAnsi="Times New Roman" w:cs="Times New Roman"/>
+      <w:sz w:val="24"/>
+      <w:szCs w:val="24"/>
+    </w:rPr>
+  </w:style>
 </w:styles>
 </file>
 

</xml_diff>

<commit_message>
Thêm tính năng Đăng nhập và Session
</commit_message>
<xml_diff>
--- a/OneDrive/Máy tính/Dự_Án_Web_Cá_Nhân/Lo-Trinh-CT428.docx
+++ b/OneDrive/Máy tính/Dự_Án_Web_Cá_Nhân/Lo-Trinh-CT428.docx
@@ -215,6 +215,81 @@
     </w:p>
     <w:p>
       <w:pPr>
+        <w:pStyle w:val="ListBullet"/>
+        <w:numPr>
+          <w:ilvl w:val="0"/>
+          <w:numId w:val="0"/>
+        </w:numPr>
+        <w:ind w:left="360"/>
+      </w:pPr>
+      <w:r>
+        <w:t xml:space="preserve"> </w:t>
+      </w:r>
+      <w:r>
+        <w:t>-</w:t>
+      </w:r>
+      <w:r>
+        <w:t xml:space="preserve"> </w:t>
+      </w:r>
+      <w:r>
+        <w:rPr>
+          <w:b/>
+          <w:bCs/>
+        </w:rPr>
+        <w:t>Phần đang thực hiện:</w:t>
+      </w:r>
+      <w:r>
+        <w:t xml:space="preserve"> Xây dựng chức năng Đăng nhập (Login) và quản lý phiên làm việc (Session) của người dùng.</w:t>
+      </w:r>
+      <w:r>
+        <w:t xml:space="preserve"> </w:t>
+      </w:r>
+      <w:r>
+        <w:rPr>
+          <w:b/>
+          <w:bCs/>
+        </w:rPr>
+        <w:t>Vị trí tác chiến:</w:t>
+      </w:r>
+      <w:r>
+        <w:t xml:space="preserve"> Cập nhật file classes/User.php và tạo mới file login.php.</w:t>
+      </w:r>
+      <w:r>
+        <w:t xml:space="preserve"> </w:t>
+      </w:r>
+      <w:r>
+        <w:rPr>
+          <w:b/>
+          <w:bCs/>
+        </w:rPr>
+        <w:t>Tiến độ hiện tại:</w:t>
+      </w:r>
+      <w:r>
+        <w:t xml:space="preserve"> </w:t>
+      </w:r>
+      <w:r>
+        <w:rPr>
+          <w:b/>
+          <w:bCs/>
+        </w:rPr>
+        <w:t>30%</w:t>
+      </w:r>
+      <w:r>
+        <w:t>.</w:t>
+      </w:r>
+    </w:p>
+    <w:p>
+      <w:pPr>
+        <w:pStyle w:val="ListBullet"/>
+        <w:numPr>
+          <w:ilvl w:val="0"/>
+          <w:numId w:val="0"/>
+        </w:numPr>
+        <w:ind w:left="360"/>
+      </w:pPr>
+    </w:p>
+    <w:p>
+      <w:pPr>
         <w:pStyle w:val="Heading1"/>
       </w:pPr>
       <w:r>
@@ -250,6 +325,7 @@
         <w:pStyle w:val="ListBullet2"/>
       </w:pPr>
       <w:r>
+        <w:lastRenderedPageBreak/>
         <w:t>Chuyển đổi tư duy OOP từ Java sang Lập trình hướng đối tượng với PHP. Cấu trúc class, phương thức và thuộc tính trong PHP sẽ rất quen thuộc với bạn.</w:t>
       </w:r>
     </w:p>
@@ -266,7 +342,6 @@
         <w:pStyle w:val="Heading1"/>
       </w:pPr>
       <w:r>
-        <w:lastRenderedPageBreak/>
         <w:t>Tuần 3: Tương tác Cơ sở dữ liệu, AJAX và Bảo mật (Chương 6)</w:t>
       </w:r>
     </w:p>

</xml_diff>

<commit_message>
Cập nhật trang chủ Dashboard và thêm chức năng Đăng xuất
</commit_message>
<xml_diff>
--- a/OneDrive/Máy tính/Dự_Án_Web_Cá_Nhân/Lo-Trinh-CT428.docx
+++ b/OneDrive/Máy tính/Dự_Án_Web_Cá_Nhân/Lo-Trinh-CT428.docx
@@ -290,6 +290,75 @@
     </w:p>
     <w:p>
       <w:pPr>
+        <w:pStyle w:val="ListBullet"/>
+        <w:numPr>
+          <w:ilvl w:val="0"/>
+          <w:numId w:val="0"/>
+        </w:numPr>
+        <w:ind w:left="360"/>
+      </w:pPr>
+      <w:r>
+        <w:t xml:space="preserve">- </w:t>
+      </w:r>
+      <w:r>
+        <w:rPr>
+          <w:b/>
+          <w:bCs/>
+        </w:rPr>
+        <w:t>Phần đang thực hiện:</w:t>
+      </w:r>
+      <w:r>
+        <w:t xml:space="preserve"> Xây dựng trang đích (Dashboard) sau khi đăng nhập và chức năng Đăng xuất (Logout) an toàn.</w:t>
+      </w:r>
+      <w:r>
+        <w:t xml:space="preserve"> </w:t>
+      </w:r>
+      <w:r>
+        <w:rPr>
+          <w:b/>
+          <w:bCs/>
+        </w:rPr>
+        <w:t>Vị trí tác chiến:</w:t>
+      </w:r>
+      <w:r>
+        <w:t xml:space="preserve"> Cập nhật file index.php và tạo mới file logout.php.</w:t>
+      </w:r>
+      <w:r>
+        <w:t xml:space="preserve"> </w:t>
+      </w:r>
+      <w:r>
+        <w:rPr>
+          <w:b/>
+          <w:bCs/>
+        </w:rPr>
+        <w:t>Tiến độ hiện tại:</w:t>
+      </w:r>
+      <w:r>
+        <w:t xml:space="preserve"> </w:t>
+      </w:r>
+      <w:r>
+        <w:rPr>
+          <w:b/>
+          <w:bCs/>
+        </w:rPr>
+        <w:t>35%</w:t>
+      </w:r>
+      <w:r>
+        <w:t>.</w:t>
+      </w:r>
+    </w:p>
+    <w:p>
+      <w:pPr>
+        <w:pStyle w:val="ListBullet"/>
+        <w:numPr>
+          <w:ilvl w:val="0"/>
+          <w:numId w:val="0"/>
+        </w:numPr>
+        <w:ind w:left="360"/>
+      </w:pPr>
+    </w:p>
+    <w:p>
+      <w:pPr>
         <w:pStyle w:val="Heading1"/>
       </w:pPr>
       <w:r>
@@ -309,6 +378,7 @@
         <w:pStyle w:val="ListBullet"/>
       </w:pPr>
       <w:r>
+        <w:lastRenderedPageBreak/>
         <w:t>Hành động:</w:t>
       </w:r>
     </w:p>
@@ -325,7 +395,6 @@
         <w:pStyle w:val="ListBullet2"/>
       </w:pPr>
       <w:r>
-        <w:lastRenderedPageBreak/>
         <w:t>Chuyển đổi tư duy OOP từ Java sang Lập trình hướng đối tượng với PHP. Cấu trúc class, phương thức và thuộc tính trong PHP sẽ rất quen thuộc với bạn.</w:t>
       </w:r>
     </w:p>

</xml_diff>

<commit_message>
Thêm bảng products và class Product xử lý logic
</commit_message>
<xml_diff>
--- a/OneDrive/Máy tính/Dự_Án_Web_Cá_Nhân/Lo-Trinh-CT428.docx
+++ b/OneDrive/Máy tính/Dự_Án_Web_Cá_Nhân/Lo-Trinh-CT428.docx
@@ -359,9 +359,79 @@
     </w:p>
     <w:p>
       <w:pPr>
+        <w:pStyle w:val="ListBullet"/>
+        <w:numPr>
+          <w:ilvl w:val="0"/>
+          <w:numId w:val="0"/>
+        </w:numPr>
+        <w:ind w:left="360"/>
+      </w:pPr>
+      <w:r>
+        <w:t xml:space="preserve">- </w:t>
+      </w:r>
+      <w:r>
+        <w:rPr>
+          <w:b/>
+          <w:bCs/>
+        </w:rPr>
+        <w:t>Phần đang thực hiện:</w:t>
+      </w:r>
+      <w:r>
+        <w:t xml:space="preserve"> Xây dựng cấu trúc Cơ sở dữ liệu và Lớp xử lý nghiệp vụ cho Sản phẩm (Products) - Chức năng cốt lõi của Web Bán Hàng.</w:t>
+      </w:r>
+      <w:r>
+        <w:t xml:space="preserve"> </w:t>
+      </w:r>
+      <w:r>
+        <w:rPr>
+          <w:b/>
+          <w:bCs/>
+        </w:rPr>
+        <w:t>Vị trí tác chiến:</w:t>
+      </w:r>
+      <w:r>
+        <w:t xml:space="preserve"> MySQL Workbench và tạo mới file classes/Product.php.</w:t>
+      </w:r>
+      <w:r>
+        <w:t xml:space="preserve"> </w:t>
+      </w:r>
+      <w:r>
+        <w:rPr>
+          <w:b/>
+          <w:bCs/>
+        </w:rPr>
+        <w:t>Tiến độ hiện tại:</w:t>
+      </w:r>
+      <w:r>
+        <w:t xml:space="preserve"> </w:t>
+      </w:r>
+      <w:r>
+        <w:rPr>
+          <w:b/>
+          <w:bCs/>
+        </w:rPr>
+        <w:t>40%</w:t>
+      </w:r>
+      <w:r>
+        <w:t>.</w:t>
+      </w:r>
+    </w:p>
+    <w:p>
+      <w:pPr>
+        <w:pStyle w:val="ListBullet"/>
+        <w:numPr>
+          <w:ilvl w:val="0"/>
+          <w:numId w:val="0"/>
+        </w:numPr>
+        <w:ind w:left="360"/>
+      </w:pPr>
+    </w:p>
+    <w:p>
+      <w:pPr>
         <w:pStyle w:val="Heading1"/>
       </w:pPr>
       <w:r>
+        <w:lastRenderedPageBreak/>
         <w:t>Tuần 2: Cốt lõi PHP và Xử lý Form (Chương 6)</w:t>
       </w:r>
     </w:p>
@@ -378,7 +448,6 @@
         <w:pStyle w:val="ListBullet"/>
       </w:pPr>
       <w:r>
-        <w:lastRenderedPageBreak/>
         <w:t>Hành động:</w:t>
       </w:r>
     </w:p>

</xml_diff>

<commit_message>
Thêm tính năng Upload và Thêm Sản phẩm với RBAC
</commit_message>
<xml_diff>
--- a/OneDrive/Máy tính/Dự_Án_Web_Cá_Nhân/Lo-Trinh-CT428.docx
+++ b/OneDrive/Máy tính/Dự_Án_Web_Cá_Nhân/Lo-Trinh-CT428.docx
@@ -425,13 +425,72 @@
         </w:numPr>
         <w:ind w:left="360"/>
       </w:pPr>
+      <w:r>
+        <w:lastRenderedPageBreak/>
+        <w:t xml:space="preserve">- </w:t>
+      </w:r>
+      <w:r>
+        <w:rPr>
+          <w:b/>
+          <w:bCs/>
+        </w:rPr>
+        <w:t>Phần đang thực hiện:</w:t>
+      </w:r>
+      <w:r>
+        <w:t xml:space="preserve"> Áp dụng Phân quyền truy cập (RBAC) và xây dựng module Thêm Sản Phẩm với tính năng Upload hình ảnh an toàn.</w:t>
+      </w:r>
+      <w:r>
+        <w:t xml:space="preserve"> </w:t>
+      </w:r>
+      <w:r>
+        <w:rPr>
+          <w:b/>
+          <w:bCs/>
+        </w:rPr>
+        <w:t>Vị trí tác chiến:</w:t>
+      </w:r>
+      <w:r>
+        <w:t xml:space="preserve"> Tạo mới thư mục assets/images/products và file add_product.php.</w:t>
+      </w:r>
+      <w:r>
+        <w:t xml:space="preserve"> </w:t>
+      </w:r>
+      <w:r>
+        <w:rPr>
+          <w:b/>
+          <w:bCs/>
+        </w:rPr>
+        <w:t>Tiến độ hiện tại:</w:t>
+      </w:r>
+      <w:r>
+        <w:t xml:space="preserve"> </w:t>
+      </w:r>
+      <w:r>
+        <w:rPr>
+          <w:b/>
+          <w:bCs/>
+        </w:rPr>
+        <w:t>45%</w:t>
+      </w:r>
+      <w:r>
+        <w:t>.</w:t>
+      </w:r>
+    </w:p>
+    <w:p>
+      <w:pPr>
+        <w:pStyle w:val="ListBullet"/>
+        <w:numPr>
+          <w:ilvl w:val="0"/>
+          <w:numId w:val="0"/>
+        </w:numPr>
+        <w:ind w:left="360"/>
+      </w:pPr>
     </w:p>
     <w:p>
       <w:pPr>
         <w:pStyle w:val="Heading1"/>
       </w:pPr>
       <w:r>
-        <w:lastRenderedPageBreak/>
         <w:t>Tuần 2: Cốt lõi PHP và Xử lý Form (Chương 6)</w:t>
       </w:r>
     </w:p>
@@ -576,6 +635,7 @@
         <w:pStyle w:val="ListBullet2"/>
       </w:pPr>
       <w:r>
+        <w:lastRenderedPageBreak/>
         <w:t>Khởi tạo ngay một repository cho dự án môn học này. Việc thực hiện các thao tác clone, commit và push lên GitHub thường xuyên không chỉ giúp lưu trữ mã nguồn an toàn mà còn tạo minh chứng rõ nét về quá trình phát triển dự án thực tế.</w:t>
       </w:r>
     </w:p>

</xml_diff>

<commit_message>
Cập nhật trang chủ hiển thị danh sách sản phẩm dạng lưới
</commit_message>
<xml_diff>
--- a/OneDrive/Máy tính/Dự_Án_Web_Cá_Nhân/Lo-Trinh-CT428.docx
+++ b/OneDrive/Máy tính/Dự_Án_Web_Cá_Nhân/Lo-Trinh-CT428.docx
@@ -488,6 +488,68 @@
     </w:p>
     <w:p>
       <w:pPr>
+        <w:pStyle w:val="ListBullet"/>
+        <w:numPr>
+          <w:ilvl w:val="0"/>
+          <w:numId w:val="0"/>
+        </w:numPr>
+        <w:ind w:left="360"/>
+      </w:pPr>
+      <w:r>
+        <w:t>-</w:t>
+      </w:r>
+      <w:r>
+        <w:t xml:space="preserve"> </w:t>
+      </w:r>
+      <w:r>
+        <w:rPr>
+          <w:b/>
+          <w:bCs/>
+        </w:rPr>
+        <w:t>Phần đang thực hiện:</w:t>
+      </w:r>
+      <w:r>
+        <w:t xml:space="preserve"> Hiển thị danh sách Sản phẩm trên Trang chủ (Frontend) và xử lý luồng đọc dữ liệu an toàn (Backend).</w:t>
+      </w:r>
+      <w:r>
+        <w:t xml:space="preserve"> </w:t>
+      </w:r>
+      <w:r>
+        <w:rPr>
+          <w:b/>
+          <w:bCs/>
+        </w:rPr>
+        <w:t>Vị trí tác chiến:</w:t>
+      </w:r>
+      <w:r>
+        <w:t xml:space="preserve"> Cập nhật file index.php.</w:t>
+      </w:r>
+      <w:r>
+        <w:t xml:space="preserve">  </w:t>
+      </w:r>
+      <w:r>
+        <w:rPr>
+          <w:b/>
+          <w:bCs/>
+        </w:rPr>
+        <w:t>Tiến độ hiện tại:</w:t>
+      </w:r>
+      <w:r>
+        <w:t xml:space="preserve"> </w:t>
+      </w:r>
+      <w:r>
+        <w:rPr>
+          <w:b/>
+          <w:bCs/>
+        </w:rPr>
+        <w:t>50%</w:t>
+      </w:r>
+      <w:r>
+        <w:t>.</w:t>
+      </w:r>
+    </w:p>
+    <w:p>
+      <w:pPr>
         <w:pStyle w:val="Heading1"/>
       </w:pPr>
       <w:r>
@@ -627,6 +689,7 @@
         <w:pStyle w:val="ListBullet2"/>
       </w:pPr>
       <w:r>
+        <w:lastRenderedPageBreak/>
         <w:t>Liên kết các module lại để lên khung thiết kế cho một ứng dụng web động hoàn chỉnh (Đặc tả, Phân tích, Thiết kế).</w:t>
       </w:r>
     </w:p>
@@ -635,7 +698,6 @@
         <w:pStyle w:val="ListBullet2"/>
       </w:pPr>
       <w:r>
-        <w:lastRenderedPageBreak/>
         <w:t>Khởi tạo ngay một repository cho dự án môn học này. Việc thực hiện các thao tác clone, commit và push lên GitHub thường xuyên không chỉ giúp lưu trữ mã nguồn an toàn mà còn tạo minh chứng rõ nét về quá trình phát triển dự án thực tế.</w:t>
       </w:r>
     </w:p>

</xml_diff>

<commit_message>
Thêm trang chi tiết sản phẩm và xử lý GET parameter an toàn
</commit_message>
<xml_diff>
--- a/OneDrive/Máy tính/Dự_Án_Web_Cá_Nhân/Lo-Trinh-CT428.docx
+++ b/OneDrive/Máy tính/Dự_Án_Web_Cá_Nhân/Lo-Trinh-CT428.docx
@@ -550,6 +550,85 @@
     </w:p>
     <w:p>
       <w:pPr>
+        <w:pStyle w:val="ListBullet"/>
+        <w:numPr>
+          <w:ilvl w:val="0"/>
+          <w:numId w:val="0"/>
+        </w:numPr>
+        <w:ind w:left="360"/>
+      </w:pPr>
+    </w:p>
+    <w:p>
+      <w:pPr>
+        <w:pStyle w:val="ListBullet"/>
+        <w:numPr>
+          <w:ilvl w:val="0"/>
+          <w:numId w:val="0"/>
+        </w:numPr>
+        <w:ind w:left="360"/>
+      </w:pPr>
+      <w:r>
+        <w:t xml:space="preserve">- </w:t>
+      </w:r>
+      <w:r>
+        <w:rPr>
+          <w:b/>
+          <w:bCs/>
+        </w:rPr>
+        <w:t>Phần đang thực hiện:</w:t>
+      </w:r>
+      <w:r>
+        <w:t xml:space="preserve"> Xây dựng trang Xem Chi Tiết Sản Phẩm và bảo mật tham số trên URL (GET request).</w:t>
+      </w:r>
+      <w:r>
+        <w:t xml:space="preserve"> </w:t>
+      </w:r>
+      <w:r>
+        <w:rPr>
+          <w:b/>
+          <w:bCs/>
+        </w:rPr>
+        <w:t>Vị trí tác chiến:</w:t>
+      </w:r>
+      <w:r>
+        <w:t xml:space="preserve"> Cập nhật classes/Product.php, index.php và tạo mới product_detail.php.</w:t>
+      </w:r>
+      <w:r>
+        <w:t xml:space="preserve"> </w:t>
+      </w:r>
+      <w:r>
+        <w:rPr>
+          <w:b/>
+          <w:bCs/>
+        </w:rPr>
+        <w:t>Tiến độ hiện tại:</w:t>
+      </w:r>
+      <w:r>
+        <w:t xml:space="preserve"> </w:t>
+      </w:r>
+      <w:r>
+        <w:rPr>
+          <w:b/>
+          <w:bCs/>
+        </w:rPr>
+        <w:t>55%</w:t>
+      </w:r>
+      <w:r>
+        <w:t>.</w:t>
+      </w:r>
+    </w:p>
+    <w:p>
+      <w:pPr>
+        <w:pStyle w:val="ListBullet"/>
+        <w:numPr>
+          <w:ilvl w:val="0"/>
+          <w:numId w:val="0"/>
+        </w:numPr>
+        <w:ind w:left="360"/>
+      </w:pPr>
+    </w:p>
+    <w:p>
+      <w:pPr>
         <w:pStyle w:val="Heading1"/>
       </w:pPr>
       <w:r>
@@ -673,6 +752,7 @@
         <w:pStyle w:val="ListBullet2"/>
       </w:pPr>
       <w:r>
+        <w:lastRenderedPageBreak/>
         <w:t>Khám phá môi trường Node.js cùng các module thông dụng (như HTTP, File system, Event).</w:t>
       </w:r>
     </w:p>
@@ -689,7 +769,6 @@
         <w:pStyle w:val="ListBullet2"/>
       </w:pPr>
       <w:r>
-        <w:lastRenderedPageBreak/>
         <w:t>Liên kết các module lại để lên khung thiết kế cho một ứng dụng web động hoàn chỉnh (Đặc tả, Phân tích, Thiết kế).</w:t>
       </w:r>
     </w:p>

</xml_diff>

<commit_message>
Bổ sung chức năng Giỏ hàng sử dụng Session
</commit_message>
<xml_diff>
--- a/OneDrive/Máy tính/Dự_Án_Web_Cá_Nhân/Lo-Trinh-CT428.docx
+++ b/OneDrive/Máy tính/Dự_Án_Web_Cá_Nhân/Lo-Trinh-CT428.docx
@@ -629,6 +629,75 @@
     </w:p>
     <w:p>
       <w:pPr>
+        <w:pStyle w:val="ListBullet"/>
+        <w:numPr>
+          <w:ilvl w:val="0"/>
+          <w:numId w:val="0"/>
+        </w:numPr>
+        <w:ind w:left="360"/>
+      </w:pPr>
+      <w:r>
+        <w:t xml:space="preserve">- </w:t>
+      </w:r>
+      <w:r>
+        <w:rPr>
+          <w:b/>
+          <w:bCs/>
+        </w:rPr>
+        <w:t>Phần đang thực hiện:</w:t>
+      </w:r>
+      <w:r>
+        <w:t xml:space="preserve"> Xây dựng logic Giỏ Hàng (Cart) sử dụng phiên làm việc (Session).</w:t>
+      </w:r>
+      <w:r>
+        <w:t xml:space="preserve"> </w:t>
+      </w:r>
+      <w:r>
+        <w:rPr>
+          <w:b/>
+          <w:bCs/>
+        </w:rPr>
+        <w:t>Vị trí tác chiến:</w:t>
+      </w:r>
+      <w:r>
+        <w:t xml:space="preserve"> Tạo mới file add_to_cart.php và cart.php.</w:t>
+      </w:r>
+      <w:r>
+        <w:t xml:space="preserve"> </w:t>
+      </w:r>
+      <w:r>
+        <w:rPr>
+          <w:b/>
+          <w:bCs/>
+        </w:rPr>
+        <w:t>Tiến độ hiện tại:</w:t>
+      </w:r>
+      <w:r>
+        <w:t xml:space="preserve"> </w:t>
+      </w:r>
+      <w:r>
+        <w:rPr>
+          <w:b/>
+          <w:bCs/>
+        </w:rPr>
+        <w:t>60%</w:t>
+      </w:r>
+      <w:r>
+        <w:t>.</w:t>
+      </w:r>
+    </w:p>
+    <w:p>
+      <w:pPr>
+        <w:pStyle w:val="ListBullet"/>
+        <w:numPr>
+          <w:ilvl w:val="0"/>
+          <w:numId w:val="0"/>
+        </w:numPr>
+        <w:ind w:left="360"/>
+      </w:pPr>
+    </w:p>
+    <w:p>
+      <w:pPr>
         <w:pStyle w:val="Heading1"/>
       </w:pPr>
       <w:r>
@@ -728,6 +797,7 @@
         <w:pStyle w:val="Heading1"/>
       </w:pPr>
       <w:r>
+        <w:lastRenderedPageBreak/>
         <w:t>Tuần 4: Node.js và Đóng gói Dự án (Chương 7 - 8)</w:t>
       </w:r>
     </w:p>
@@ -752,7 +822,6 @@
         <w:pStyle w:val="ListBullet2"/>
       </w:pPr>
       <w:r>
-        <w:lastRenderedPageBreak/>
         <w:t>Khám phá môi trường Node.js cùng các module thông dụng (như HTTP, File system, Event).</w:t>
       </w:r>
     </w:p>

</xml_diff>

<commit_message>
Thêm tính năng Lịch sử đơn hàng (Order History) bảo mật IDOR
</commit_message>
<xml_diff>
--- a/OneDrive/Máy tính/Dự_Án_Web_Cá_Nhân/Lo-Trinh-CT428.docx
+++ b/OneDrive/Máy tính/Dự_Án_Web_Cá_Nhân/Lo-Trinh-CT428.docx
@@ -685,6 +685,153 @@
       <w:r>
         <w:t>.</w:t>
       </w:r>
+      <w:r>
+        <w:t xml:space="preserve"> </w:t>
+      </w:r>
+    </w:p>
+    <w:p>
+      <w:pPr>
+        <w:pStyle w:val="ListBullet"/>
+        <w:numPr>
+          <w:ilvl w:val="0"/>
+          <w:numId w:val="0"/>
+        </w:numPr>
+        <w:ind w:left="360"/>
+      </w:pPr>
+    </w:p>
+    <w:p>
+      <w:pPr>
+        <w:pStyle w:val="ListBullet"/>
+        <w:numPr>
+          <w:ilvl w:val="0"/>
+          <w:numId w:val="0"/>
+        </w:numPr>
+        <w:ind w:left="360"/>
+      </w:pPr>
+      <w:r>
+        <w:t>-</w:t>
+      </w:r>
+      <w:r>
+        <w:t xml:space="preserve"> </w:t>
+      </w:r>
+      <w:r>
+        <w:rPr>
+          <w:b/>
+          <w:bCs/>
+        </w:rPr>
+        <w:t>Phần đang thực hiện:</w:t>
+      </w:r>
+      <w:r>
+        <w:t xml:space="preserve"> Xây dựng luồng Thanh toán (Checkout) và đảm bảo Toàn vẹn dữ liệu giao dịch (Data Integrity).</w:t>
+      </w:r>
+      <w:r>
+        <w:t xml:space="preserve"> </w:t>
+      </w:r>
+      <w:r>
+        <w:rPr>
+          <w:b/>
+          <w:bCs/>
+        </w:rPr>
+        <w:t>Vị trí tác chiến:</w:t>
+      </w:r>
+      <w:r>
+        <w:t xml:space="preserve"> MySQL Workbench, tạo mới file classes/Order.php và checkout.php.</w:t>
+      </w:r>
+      <w:r>
+        <w:t xml:space="preserve"> </w:t>
+      </w:r>
+      <w:r>
+        <w:rPr>
+          <w:b/>
+          <w:bCs/>
+        </w:rPr>
+        <w:t>Tiến độ hiện tại:</w:t>
+      </w:r>
+      <w:r>
+        <w:t xml:space="preserve"> </w:t>
+      </w:r>
+      <w:r>
+        <w:rPr>
+          <w:b/>
+          <w:bCs/>
+        </w:rPr>
+        <w:t>65%</w:t>
+      </w:r>
+      <w:r>
+        <w:t>.</w:t>
+      </w:r>
+    </w:p>
+    <w:p>
+      <w:pPr>
+        <w:pStyle w:val="ListBullet"/>
+        <w:numPr>
+          <w:ilvl w:val="0"/>
+          <w:numId w:val="0"/>
+        </w:numPr>
+        <w:ind w:left="360"/>
+      </w:pPr>
+    </w:p>
+    <w:p>
+      <w:pPr>
+        <w:pStyle w:val="ListBullet"/>
+        <w:numPr>
+          <w:ilvl w:val="0"/>
+          <w:numId w:val="0"/>
+        </w:numPr>
+        <w:ind w:left="360"/>
+      </w:pPr>
+      <w:r>
+        <w:t>-</w:t>
+      </w:r>
+      <w:r>
+        <w:t xml:space="preserve"> </w:t>
+      </w:r>
+      <w:r>
+        <w:rPr>
+          <w:b/>
+          <w:bCs/>
+        </w:rPr>
+        <w:t>Phần đang thực hiện:</w:t>
+      </w:r>
+      <w:r>
+        <w:t xml:space="preserve"> Xây dựng trang Lịch sử mua hàng (Order History) và thiết lập cơ chế kiểm soát quyền sở hữu dữ liệu.</w:t>
+      </w:r>
+      <w:r>
+        <w:t xml:space="preserve"> </w:t>
+      </w:r>
+      <w:r>
+        <w:rPr>
+          <w:b/>
+          <w:bCs/>
+        </w:rPr>
+        <w:t>Vị trí tác chiến:</w:t>
+      </w:r>
+      <w:r>
+        <w:t xml:space="preserve"> Cập nhật classes/Order.php và tạo mới order_history.php.</w:t>
+      </w:r>
+      <w:r>
+        <w:t xml:space="preserve"> </w:t>
+      </w:r>
+      <w:r>
+        <w:rPr>
+          <w:b/>
+          <w:bCs/>
+        </w:rPr>
+        <w:t>Tiến độ hiện tại:</w:t>
+      </w:r>
+      <w:r>
+        <w:t xml:space="preserve"> </w:t>
+      </w:r>
+      <w:r>
+        <w:rPr>
+          <w:b/>
+          <w:bCs/>
+        </w:rPr>
+        <w:t>70%</w:t>
+      </w:r>
+      <w:r>
+        <w:t>.</w:t>
+      </w:r>
     </w:p>
     <w:p>
       <w:pPr>
@@ -781,6 +928,7 @@
         <w:pStyle w:val="ListBullet2"/>
       </w:pPr>
       <w:r>
+        <w:lastRenderedPageBreak/>
         <w:t>Viết mã AJAX giao tiếp bất đồng bộ, ứng dụng vào việc kiểm tra tên đăng nhập bị trùng ngay tại form đăng ký.</w:t>
       </w:r>
     </w:p>
@@ -797,7 +945,6 @@
         <w:pStyle w:val="Heading1"/>
       </w:pPr>
       <w:r>
-        <w:lastRenderedPageBreak/>
         <w:t>Tuần 4: Node.js và Đóng gói Dự án (Chương 7 - 8)</w:t>
       </w:r>
     </w:p>

</xml_diff>

<commit_message>
Thêm tính năng Chat Realtime bằng Socket.io
</commit_message>
<xml_diff>
--- a/OneDrive/Máy tính/Dự_Án_Web_Cá_Nhân/Lo-Trinh-CT428.docx
+++ b/OneDrive/Máy tính/Dự_Án_Web_Cá_Nhân/Lo-Trinh-CT428.docx
@@ -845,90 +845,366 @@
     </w:p>
     <w:p>
       <w:pPr>
-        <w:pStyle w:val="Heading1"/>
-      </w:pPr>
-      <w:r>
-        <w:t>Tuần 2: Cốt lõi PHP và Xử lý Form (Chương 6)</w:t>
+        <w:pStyle w:val="ListBullet"/>
+        <w:numPr>
+          <w:ilvl w:val="0"/>
+          <w:numId w:val="0"/>
+        </w:numPr>
+        <w:ind w:left="360"/>
+      </w:pPr>
+      <w:r>
+        <w:t xml:space="preserve">- </w:t>
+      </w:r>
+      <w:r>
+        <w:rPr>
+          <w:b/>
+          <w:bCs/>
+        </w:rPr>
+        <w:t>Phần đang thực hiện:</w:t>
+      </w:r>
+      <w:r>
+        <w:t xml:space="preserve"> Áp dụng kỹ thuật AJAX giao tiếp bất đồng bộ để nâng cao trải nghiệm người dùng (UX) và bảo mật form.</w:t>
+      </w:r>
+      <w:r>
+        <w:t xml:space="preserve"> </w:t>
+      </w:r>
+      <w:r>
+        <w:rPr>
+          <w:b/>
+          <w:bCs/>
+        </w:rPr>
+        <w:t>Vị trí tác chiến:</w:t>
+      </w:r>
+      <w:r>
+        <w:t xml:space="preserve"> Cập nhật classes/User.php, register.php và tạo API check_username.php.</w:t>
+      </w:r>
+      <w:r>
+        <w:t xml:space="preserve"> </w:t>
+      </w:r>
+      <w:r>
+        <w:rPr>
+          <w:b/>
+          <w:bCs/>
+        </w:rPr>
+        <w:t>Tiến độ hiện tại:</w:t>
+      </w:r>
+      <w:r>
+        <w:t xml:space="preserve"> </w:t>
+      </w:r>
+      <w:r>
+        <w:rPr>
+          <w:b/>
+          <w:bCs/>
+        </w:rPr>
+        <w:t>75%</w:t>
+      </w:r>
+      <w:r>
+        <w:t>.</w:t>
       </w:r>
     </w:p>
     <w:p>
       <w:pPr>
         <w:pStyle w:val="ListBullet"/>
-      </w:pPr>
-      <w:r>
-        <w:t>Mục tiêu: Nắm vững ngôn ngữ kịch bản phía server.</w:t>
-      </w:r>
+        <w:numPr>
+          <w:ilvl w:val="0"/>
+          <w:numId w:val="0"/>
+        </w:numPr>
+        <w:ind w:left="360"/>
+      </w:pPr>
     </w:p>
     <w:p>
       <w:pPr>
         <w:pStyle w:val="ListBullet"/>
-      </w:pPr>
-      <w:r>
-        <w:t>Hành động:</w:t>
+        <w:numPr>
+          <w:ilvl w:val="0"/>
+          <w:numId w:val="0"/>
+        </w:numPr>
+        <w:ind w:left="360"/>
+      </w:pPr>
+      <w:r>
+        <w:t xml:space="preserve">- </w:t>
+      </w:r>
+      <w:r>
+        <w:rPr>
+          <w:b/>
+          <w:bCs/>
+        </w:rPr>
+        <w:t>Phần đang thực hiện:</w:t>
+      </w:r>
+      <w:r>
+        <w:t xml:space="preserve"> Khởi tạo môi trường Node.js và thiết lập máy chủ WebSocket (Socket.io) cho tính năng Chat Realtime.</w:t>
+      </w:r>
+      <w:r>
+        <w:t xml:space="preserve"> </w:t>
+      </w:r>
+      <w:r>
+        <w:rPr>
+          <w:b/>
+          <w:bCs/>
+        </w:rPr>
+        <w:t>Vị trí tác chiến:</w:t>
+      </w:r>
+      <w:r>
+        <w:t xml:space="preserve"> Terminal của VS Code và thư mục mới chat_server.</w:t>
+      </w:r>
+      <w:r>
+        <w:t xml:space="preserve"> </w:t>
+      </w:r>
+      <w:r>
+        <w:rPr>
+          <w:b/>
+          <w:bCs/>
+        </w:rPr>
+        <w:t>Tiến độ hiện tại:</w:t>
+      </w:r>
+      <w:r>
+        <w:t xml:space="preserve"> </w:t>
+      </w:r>
+      <w:r>
+        <w:rPr>
+          <w:b/>
+          <w:bCs/>
+        </w:rPr>
+        <w:t>85%</w:t>
+      </w:r>
+      <w:r>
+        <w:t>.</w:t>
       </w:r>
     </w:p>
     <w:p>
       <w:pPr>
-        <w:pStyle w:val="ListBullet2"/>
-      </w:pPr>
-      <w:r>
-        <w:t>Cài đặt webserver Apache và làm quen với biến, kiểu dữ liệu, các lệnh điều khiển của PHP.</w:t>
-      </w:r>
+        <w:pStyle w:val="ListBullet"/>
+        <w:numPr>
+          <w:ilvl w:val="0"/>
+          <w:numId w:val="0"/>
+        </w:numPr>
+        <w:ind w:left="360"/>
+      </w:pPr>
     </w:p>
     <w:p>
       <w:pPr>
-        <w:pStyle w:val="ListBullet2"/>
-      </w:pPr>
-      <w:r>
-        <w:t>Chuyển đổi tư duy OOP từ Java sang Lập trình hướng đối tượng với PHP. Cấu trúc class, phương thức và thuộc tính trong PHP sẽ rất quen thuộc với bạn.</w:t>
+        <w:pStyle w:val="ListBullet"/>
+        <w:numPr>
+          <w:ilvl w:val="0"/>
+          <w:numId w:val="0"/>
+        </w:numPr>
+        <w:ind w:left="360"/>
+      </w:pPr>
+      <w:r>
+        <w:t xml:space="preserve">- </w:t>
+      </w:r>
+      <w:r>
+        <w:rPr>
+          <w:b/>
+          <w:bCs/>
+        </w:rPr>
+        <w:t>Phần đang thực hiện:</w:t>
+      </w:r>
+      <w:r>
+        <w:t xml:space="preserve"> Khởi tạo dự án Node.js độc lập và thiết lập máy chủ WebSocket (Socket.io).</w:t>
+      </w:r>
+      <w:r>
+        <w:t xml:space="preserve"> </w:t>
+      </w:r>
+      <w:r>
+        <w:rPr>
+          <w:b/>
+          <w:bCs/>
+        </w:rPr>
+        <w:t>Vị trí tác chiến:</w:t>
+      </w:r>
+      <w:r>
+        <w:t xml:space="preserve"> Thư mục mới chat_server.</w:t>
+      </w:r>
+      <w:r>
+        <w:t xml:space="preserve"> </w:t>
+      </w:r>
+      <w:r>
+        <w:rPr>
+          <w:b/>
+          <w:bCs/>
+        </w:rPr>
+        <w:t>Tiến độ hiện tại:</w:t>
+      </w:r>
+      <w:r>
+        <w:t xml:space="preserve"> </w:t>
+      </w:r>
+      <w:r>
+        <w:rPr>
+          <w:b/>
+          <w:bCs/>
+        </w:rPr>
+        <w:t>85%</w:t>
+      </w:r>
+      <w:r>
+        <w:t>.</w:t>
       </w:r>
     </w:p>
     <w:p>
       <w:pPr>
-        <w:pStyle w:val="ListBullet2"/>
-      </w:pPr>
-      <w:r>
-        <w:t>Thực hành các kỹ thuật truyền nhận dữ liệu qua Form, cùng với cách quản lý trạng thái người dùng bằng Session và Cookie.</w:t>
-      </w:r>
+        <w:pStyle w:val="ListBullet"/>
+        <w:numPr>
+          <w:ilvl w:val="0"/>
+          <w:numId w:val="0"/>
+        </w:numPr>
+        <w:ind w:left="360"/>
+      </w:pPr>
     </w:p>
     <w:p>
       <w:pPr>
-        <w:pStyle w:val="Heading1"/>
-      </w:pPr>
-      <w:r>
-        <w:t>Tuần 3: Tương tác Cơ sở dữ liệu, AJAX và Bảo mật (Chương 6)</w:t>
+        <w:pStyle w:val="ListBullet"/>
+        <w:numPr>
+          <w:ilvl w:val="0"/>
+          <w:numId w:val="0"/>
+        </w:numPr>
+        <w:ind w:left="360"/>
+      </w:pPr>
+      <w:r>
+        <w:t xml:space="preserve">- </w:t>
+      </w:r>
+      <w:r>
+        <w:rPr>
+          <w:b/>
+          <w:bCs/>
+        </w:rPr>
+        <w:t>Phần đang thực hiện:</w:t>
+      </w:r>
+      <w:r>
+        <w:t xml:space="preserve"> Xây dựng Giao diện Chat (Frontend) bằng PHP/HTML và kết nối vào máy chủ Node.js thông qua Socket.io.</w:t>
+      </w:r>
+      <w:r>
+        <w:t xml:space="preserve"> </w:t>
+      </w:r>
+      <w:r>
+        <w:rPr>
+          <w:b/>
+          <w:bCs/>
+        </w:rPr>
+        <w:t>Vị trí tác chiến:</w:t>
+      </w:r>
+      <w:r>
+        <w:t xml:space="preserve"> Tạo mới file chat.php tại thư mục gốc của dự án.</w:t>
+      </w:r>
+      <w:r>
+        <w:t xml:space="preserve"> </w:t>
+      </w:r>
+      <w:r>
+        <w:rPr>
+          <w:b/>
+          <w:bCs/>
+        </w:rPr>
+        <w:t>Tiến độ hiện tại:</w:t>
+      </w:r>
+      <w:r>
+        <w:t xml:space="preserve"> </w:t>
+      </w:r>
+      <w:r>
+        <w:rPr>
+          <w:b/>
+          <w:bCs/>
+        </w:rPr>
+        <w:t>90%</w:t>
+      </w:r>
+      <w:r>
+        <w:t>.</w:t>
       </w:r>
     </w:p>
     <w:p>
       <w:pPr>
         <w:pStyle w:val="ListBullet"/>
-      </w:pPr>
-      <w:r>
-        <w:t>Mục tiêu: Hoàn thiện luồng dữ liệu động và tối ưu trải nghiệm.</w:t>
-      </w:r>
+        <w:numPr>
+          <w:ilvl w:val="0"/>
+          <w:numId w:val="0"/>
+        </w:numPr>
+        <w:ind w:left="360"/>
+      </w:pPr>
     </w:p>
     <w:p>
       <w:pPr>
-        <w:pStyle w:val="ListBullet"/>
-      </w:pPr>
-      <w:r>
-        <w:t>Hành động:</w:t>
+        <w:pStyle w:val="Heading1"/>
+      </w:pPr>
+      <w:r>
+        <w:t>Tuần 2: Cốt lõi PHP và Xử lý Form (Chương 6)</w:t>
       </w:r>
     </w:p>
     <w:p>
       <w:pPr>
-        <w:pStyle w:val="ListBullet2"/>
-      </w:pPr>
-      <w:r>
-        <w:t>Sử dụng PHP (đặc biệt là PDO) để kết nối và thao tác với MySQL (thêm, sửa, xóa, hiển thị sản phẩm, giỏ hàng).</w:t>
+        <w:pStyle w:val="ListBullet"/>
+      </w:pPr>
+      <w:r>
+        <w:t>Mục tiêu: Nắm vững ngôn ngữ kịch bản phía server.</w:t>
       </w:r>
     </w:p>
     <w:p>
       <w:pPr>
+        <w:pStyle w:val="ListBullet"/>
+      </w:pPr>
+      <w:r>
+        <w:lastRenderedPageBreak/>
+        <w:t>Hành động:</w:t>
+      </w:r>
+    </w:p>
+    <w:p>
+      <w:pPr>
         <w:pStyle w:val="ListBullet2"/>
       </w:pPr>
       <w:r>
-        <w:lastRenderedPageBreak/>
+        <w:t>Cài đặt webserver Apache và làm quen với biến, kiểu dữ liệu, các lệnh điều khiển của PHP.</w:t>
+      </w:r>
+    </w:p>
+    <w:p>
+      <w:pPr>
+        <w:pStyle w:val="ListBullet2"/>
+      </w:pPr>
+      <w:r>
+        <w:t>Chuyển đổi tư duy OOP từ Java sang Lập trình hướng đối tượng với PHP. Cấu trúc class, phương thức và thuộc tính trong PHP sẽ rất quen thuộc với bạn.</w:t>
+      </w:r>
+    </w:p>
+    <w:p>
+      <w:pPr>
+        <w:pStyle w:val="ListBullet2"/>
+      </w:pPr>
+      <w:r>
+        <w:t>Thực hành các kỹ thuật truyền nhận dữ liệu qua Form, cùng với cách quản lý trạng thái người dùng bằng Session và Cookie.</w:t>
+      </w:r>
+    </w:p>
+    <w:p>
+      <w:pPr>
+        <w:pStyle w:val="Heading1"/>
+      </w:pPr>
+      <w:r>
+        <w:t>Tuần 3: Tương tác Cơ sở dữ liệu, AJAX và Bảo mật (Chương 6)</w:t>
+      </w:r>
+    </w:p>
+    <w:p>
+      <w:pPr>
+        <w:pStyle w:val="ListBullet"/>
+      </w:pPr>
+      <w:r>
+        <w:t>Mục tiêu: Hoàn thiện luồng dữ liệu động và tối ưu trải nghiệm.</w:t>
+      </w:r>
+    </w:p>
+    <w:p>
+      <w:pPr>
+        <w:pStyle w:val="ListBullet"/>
+      </w:pPr>
+      <w:r>
+        <w:t>Hành động:</w:t>
+      </w:r>
+    </w:p>
+    <w:p>
+      <w:pPr>
+        <w:pStyle w:val="ListBullet2"/>
+      </w:pPr>
+      <w:r>
+        <w:t>Sử dụng PHP (đặc biệt là PDO) để kết nối và thao tác với MySQL (thêm, sửa, xóa, hiển thị sản phẩm, giỏ hàng).</w:t>
+      </w:r>
+    </w:p>
+    <w:p>
+      <w:pPr>
+        <w:pStyle w:val="ListBullet2"/>
+      </w:pPr>
+      <w:r>
         <w:t>Viết mã AJAX giao tiếp bất đồng bộ, ứng dụng vào việc kiểm tra tên đăng nhập bị trùng ngay tại form đăng ký.</w:t>
       </w:r>
     </w:p>

</xml_diff>